<commit_message>
docs(investor): review finance+board — tambah metrik SaaS (CAC/LTV/churn/payback), Risiko & Mitigasi + governance, catatan TAM (per-outlet+vertikal), klarifikasi setup fee, lunakkan klaim 'compliant'
</commit_message>
<xml_diff>
--- a/docs/exports/LAMASY-Investor-Brief.docx
+++ b/docs/exports/LAMASY-Investor-Brief.docx
@@ -159,7 +159,7 @@
         <w:spacing w:after="120" w:line="360"/>
       </w:pPr>
       <w:r>
-        <w:t xml:space="preserve">Kami menawarkan operasional end-to-end dalam satu platform: POS, produksi, antar-jemput, inventori, keuangan compliant SAK EMKM, plus integrasi AI yang menjadikan kami ERP pertama di Indonesia yang AI-first untuk segmen laundry.</w:t>
+        <w:t xml:space="preserve">Kami menawarkan operasional end-to-end dalam satu platform: POS, produksi, antar-jemput, inventori, keuangan yang mengacu SAK EMKM, plus integrasi AI yang menjadikan kami ERP pertama di Indonesia yang AI-first untuk segmen laundry.</w:t>
       </w:r>
     </w:p>
     <w:p>
@@ -287,7 +287,7 @@
         <w:t xml:space="preserve">Indonesia-native: </w:t>
       </w:r>
       <w:r>
-        <w:t xml:space="preserve">UU PDP compliant, SAK EMKM laporan, Bahasa Indonesia interface, WA notifikasi via wa.me (click-to-chat).</w:t>
+        <w:t xml:space="preserve">dirancang selaras UU PDP, laporan mengacu SAK EMKM, Bahasa Indonesia interface, WA notifikasi via wa.me (click-to-chat).</w:t>
       </w:r>
     </w:p>
     <w:p>
@@ -1008,6 +1008,45 @@
         </w:tc>
       </w:tr>
     </w:tbl>
+    <w:p>
+      <w:pPr>
+        <w:pBdr>
+          <w:left w:val="single" w:color="0BC3B0" w:sz="24" w:space="12"/>
+        </w:pBdr>
+        <w:shd w:fill="E6FCF9" w:val="clear"/>
+        <w:spacing w:after="160" w:before="160"/>
+      </w:pPr>
+      <w:r>
+        <w:rPr>
+          <w:b/>
+          <w:bCs/>
+          <w:color w:val="1A1F2E"/>
+          <w:sz w:val="22"/>
+          <w:szCs w:val="22"/>
+        </w:rPr>
+        <w:t xml:space="preserve">Catatan TAM: </w:t>
+      </w:r>
+      <w:r>
+        <w:rPr>
+          <w:i/>
+          <w:iCs/>
+          <w:color w:val="1A1F2E"/>
+          <w:sz w:val="22"/>
+          <w:szCs w:val="22"/>
+        </w:rPr>
+        <w:t xml:space="preserve">angka di atas konservatif (per-tenant @Rp 4 jt/thn). Basis lebih luas memperbesar TAM secara material — (a) per-OUTLET, bukan per-bisnis (rata-rata &gt;1 outlet/tenant); (b) ekspansi vertikal serupa (salon, klinik kecantikan, jasa kelola pakaian premium); (c) revenue usage-based coin AI. Estimasi diperluas: </w:t>
+      </w:r>
+      <w:r>
+        <w:rPr>
+          <w:i/>
+          <w:iCs/>
+          <w:color w:val="F59E0B"/>
+          <w:sz w:val="22"/>
+          <w:szCs w:val="22"/>
+        </w:rPr>
+        <w:t xml:space="preserve">[isi: owner]</w:t>
+      </w:r>
+    </w:p>
     <w:p>
       <w:pPr>
         <w:pStyle w:val="Heading2"/>
@@ -2339,7 +2378,7 @@
         <w:spacing w:after="80"/>
       </w:pPr>
       <w:r>
-        <w:t xml:space="preserve">Laporan SAK EMKM compliant: Neraca, Laba Rugi, Arus Kas (auto-generate)</w:t>
+        <w:t xml:space="preserve">Laporan mengacu SAK EMKM: Neraca, Laba Rugi, Arus Kas (auto-generate)</w:t>
       </w:r>
     </w:p>
     <w:p>
@@ -3673,6 +3712,14 @@
       </w:pPr>
       <w:r>
         <w:t xml:space="preserve">Onboarding tenant baru dengan provisioning, data migration assistance, training. Berkisar Rp 500K – Rp 2 jt tergantung kompleksitas (single outlet vs chain).</w:t>
+      </w:r>
+    </w:p>
+    <w:p>
+      <w:pPr>
+        <w:spacing w:after="120" w:line="360"/>
+      </w:pPr>
+      <w:r>
+        <w:t xml:space="preserve">Catatan: untuk jalur self-serve (daftar sendiri, single-outlet) setup fee di-waive agar CAC tetap rendah — fee hanya berlaku untuk tenant Chain / yang butuh asistensi migrasi &amp; training. Jadi tidak bentrok dengan strategi akuisisi self-serve.</w:t>
       </w:r>
     </w:p>
     <w:p>
@@ -5476,90 +5523,19 @@
     </w:tbl>
     <w:p>
       <w:pPr>
-        <w:pBdr>
-          <w:left w:val="single" w:color="84CC16" w:sz="24" w:space="12"/>
-        </w:pBdr>
-        <w:shd w:fill="ECFCCB" w:val="clear"/>
-        <w:spacing w:after="160" w:before="160"/>
-      </w:pPr>
-      <w:r>
-        <w:rPr>
-          <w:b/>
-          <w:bCs/>
-          <w:color w:val="1A1F2E"/>
-          <w:sz w:val="22"/>
-          <w:szCs w:val="22"/>
-        </w:rPr>
-        <w:t xml:space="preserve">Strategi: </w:t>
-      </w:r>
-      <w:r>
-        <w:rPr>
-          <w:i/>
-          <w:iCs/>
-          <w:color w:val="1A1F2E"/>
-          <w:sz w:val="22"/>
-          <w:szCs w:val="22"/>
-        </w:rPr>
-        <w:t xml:space="preserve">AI sebagai growth engine — bukan cost center. Coin top-up margin 70-80% setelah Anthropic API cost. Higher engagement = higher coin spend = higher revenue.</w:t>
-      </w:r>
-    </w:p>
-    <w:p>
-      <w:r>
-        <w:br w:type="page"/>
-      </w:r>
-    </w:p>
-    <w:p>
-      <w:pPr>
-        <w:pStyle w:val="Heading1"/>
-        <w:spacing w:after="200" w:before="480"/>
-      </w:pPr>
-      <w:r>
-        <w:t xml:space="preserve">Traction &amp; Current State</w:t>
-      </w:r>
-    </w:p>
-    <w:p>
-      <w:pPr>
-        <w:pStyle w:val="Heading2"/>
-        <w:spacing w:after="120" w:before="320"/>
-      </w:pPr>
-      <w:r>
-        <w:t xml:space="preserve">Product Maturity</w:t>
-      </w:r>
-    </w:p>
-    <w:p>
-      <w:pPr>
-        <w:pBdr>
-          <w:left w:val="single" w:color="0BC3B0" w:sz="24" w:space="12"/>
-        </w:pBdr>
-        <w:shd w:fill="E6FCF9" w:val="clear"/>
-        <w:spacing w:after="160" w:before="160"/>
-      </w:pPr>
-      <w:r>
-        <w:rPr>
-          <w:b/>
-          <w:bCs/>
-          <w:color w:val="0BC3B0"/>
-          <w:sz w:val="24"/>
-          <w:szCs w:val="24"/>
-        </w:rPr>
-        <w:t xml:space="preserve">✓ Platform LIVE di production </w:t>
-      </w:r>
-      <w:r>
-        <w:rPr>
-          <w:color w:val="1A1F2E"/>
-          <w:sz w:val="22"/>
-          <w:szCs w:val="22"/>
-        </w:rPr>
-        <w:t xml:space="preserve">(lamasy.harpy.id) dengan tenant transaksi aktif.</w:t>
-      </w:r>
-    </w:p>
-    <w:p>
-      <w:pPr>
-        <w:pStyle w:val="Heading2"/>
-        <w:spacing w:after="120" w:before="320"/>
-      </w:pPr>
-      <w:r>
-        <w:t xml:space="preserve">Technical Stats</w:t>
+        <w:pStyle w:val="Heading3"/>
+        <w:spacing w:after="80" w:before="220"/>
+      </w:pPr>
+      <w:r>
+        <w:t xml:space="preserve">Metrik Kesehatan SaaS (proyeksi)</w:t>
+      </w:r>
+    </w:p>
+    <w:p>
+      <w:pPr>
+        <w:spacing w:after="120" w:line="360"/>
+      </w:pPr>
+      <w:r>
+        <w:t xml:space="preserve">Metrik standar yang diminta investor — diisi dengan data/asumsi riil saat fundraising:</w:t>
       </w:r>
     </w:p>
     <w:tbl>
@@ -5609,6 +5585,744 @@
                 <w:sz w:val="20"/>
                 <w:szCs w:val="20"/>
               </w:rPr>
+              <w:t xml:space="preserve">Metrik</w:t>
+            </w:r>
+          </w:p>
+        </w:tc>
+        <w:tc>
+          <w:tcPr>
+            <w:tcW w:type="dxa" w:w="3008"/>
+            <w:tcBorders>
+              <w:top w:val="single" w:color="E5E7EB" w:sz="4"/>
+              <w:left w:val="single" w:color="E5E7EB" w:sz="4"/>
+              <w:bottom w:val="single" w:color="E5E7EB" w:sz="4"/>
+              <w:right w:val="single" w:color="E5E7EB" w:sz="4"/>
+            </w:tcBorders>
+            <w:shd w:fill="0F1C3A" w:val="clear"/>
+            <w:tcMar>
+              <w:top w:type="dxa" w:w="100"/>
+              <w:left w:type="dxa" w:w="140"/>
+              <w:bottom w:type="dxa" w:w="100"/>
+              <w:right w:type="dxa" w:w="140"/>
+            </w:tcMar>
+          </w:tcPr>
+          <w:p>
+            <w:r>
+              <w:rPr>
+                <w:b/>
+                <w:bCs/>
+                <w:color w:val="FFFFFF"/>
+                <w:sz w:val="20"/>
+                <w:szCs w:val="20"/>
+              </w:rPr>
+              <w:t xml:space="preserve">Target/Asumsi</w:t>
+            </w:r>
+          </w:p>
+        </w:tc>
+        <w:tc>
+          <w:tcPr>
+            <w:tcW w:type="dxa" w:w="3008"/>
+            <w:tcBorders>
+              <w:top w:val="single" w:color="E5E7EB" w:sz="4"/>
+              <w:left w:val="single" w:color="E5E7EB" w:sz="4"/>
+              <w:bottom w:val="single" w:color="E5E7EB" w:sz="4"/>
+              <w:right w:val="single" w:color="E5E7EB" w:sz="4"/>
+            </w:tcBorders>
+            <w:shd w:fill="0F1C3A" w:val="clear"/>
+            <w:tcMar>
+              <w:top w:type="dxa" w:w="100"/>
+              <w:left w:type="dxa" w:w="140"/>
+              <w:bottom w:type="dxa" w:w="100"/>
+              <w:right w:type="dxa" w:w="140"/>
+            </w:tcMar>
+          </w:tcPr>
+          <w:p>
+            <w:r>
+              <w:rPr>
+                <w:b/>
+                <w:bCs/>
+                <w:color w:val="FFFFFF"/>
+                <w:sz w:val="20"/>
+                <w:szCs w:val="20"/>
+              </w:rPr>
+              <w:t xml:space="preserve">Catatan</w:t>
+            </w:r>
+          </w:p>
+        </w:tc>
+      </w:tr>
+      <w:tr>
+        <w:tc>
+          <w:tcPr>
+            <w:tcW w:type="dxa" w:w="3008"/>
+            <w:tcBorders>
+              <w:top w:val="single" w:color="E5E7EB" w:sz="4"/>
+              <w:left w:val="single" w:color="E5E7EB" w:sz="4"/>
+              <w:bottom w:val="single" w:color="E5E7EB" w:sz="4"/>
+              <w:right w:val="single" w:color="E5E7EB" w:sz="4"/>
+            </w:tcBorders>
+            <w:tcMar>
+              <w:top w:type="dxa" w:w="100"/>
+              <w:left w:type="dxa" w:w="140"/>
+              <w:bottom w:type="dxa" w:w="100"/>
+              <w:right w:type="dxa" w:w="140"/>
+            </w:tcMar>
+          </w:tcPr>
+          <w:p>
+            <w:r>
+              <w:rPr>
+                <w:color w:val="1A1F2E"/>
+                <w:sz w:val="21"/>
+                <w:szCs w:val="21"/>
+              </w:rPr>
+              <w:t xml:space="preserve">CAC (Customer Acquisition Cost)</w:t>
+            </w:r>
+          </w:p>
+        </w:tc>
+        <w:tc>
+          <w:tcPr>
+            <w:tcW w:type="dxa" w:w="3008"/>
+            <w:tcBorders>
+              <w:top w:val="single" w:color="E5E7EB" w:sz="4"/>
+              <w:left w:val="single" w:color="E5E7EB" w:sz="4"/>
+              <w:bottom w:val="single" w:color="E5E7EB" w:sz="4"/>
+              <w:right w:val="single" w:color="E5E7EB" w:sz="4"/>
+            </w:tcBorders>
+            <w:tcMar>
+              <w:top w:type="dxa" w:w="100"/>
+              <w:left w:type="dxa" w:w="140"/>
+              <w:bottom w:type="dxa" w:w="100"/>
+              <w:right w:type="dxa" w:w="140"/>
+            </w:tcMar>
+          </w:tcPr>
+          <w:p>
+            <w:r>
+              <w:rPr>
+                <w:color w:val="1A1F2E"/>
+                <w:sz w:val="21"/>
+                <w:szCs w:val="21"/>
+              </w:rPr>
+              <w:t xml:space="preserve">[isi: owner]</w:t>
+            </w:r>
+          </w:p>
+        </w:tc>
+        <w:tc>
+          <w:tcPr>
+            <w:tcW w:type="dxa" w:w="3008"/>
+            <w:tcBorders>
+              <w:top w:val="single" w:color="E5E7EB" w:sz="4"/>
+              <w:left w:val="single" w:color="E5E7EB" w:sz="4"/>
+              <w:bottom w:val="single" w:color="E5E7EB" w:sz="4"/>
+              <w:right w:val="single" w:color="E5E7EB" w:sz="4"/>
+            </w:tcBorders>
+            <w:tcMar>
+              <w:top w:type="dxa" w:w="100"/>
+              <w:left w:type="dxa" w:w="140"/>
+              <w:bottom w:type="dxa" w:w="100"/>
+              <w:right w:type="dxa" w:w="140"/>
+            </w:tcMar>
+          </w:tcPr>
+          <w:p>
+            <w:r>
+              <w:rPr>
+                <w:color w:val="1A1F2E"/>
+                <w:sz w:val="21"/>
+                <w:szCs w:val="21"/>
+              </w:rPr>
+              <w:t xml:space="preserve">Biaya akuisisi per tenant (S&amp;M ÷ tenant baru)</w:t>
+            </w:r>
+          </w:p>
+        </w:tc>
+      </w:tr>
+      <w:tr>
+        <w:tc>
+          <w:tcPr>
+            <w:tcW w:type="dxa" w:w="3008"/>
+            <w:tcBorders>
+              <w:top w:val="single" w:color="E5E7EB" w:sz="4"/>
+              <w:left w:val="single" w:color="E5E7EB" w:sz="4"/>
+              <w:bottom w:val="single" w:color="E5E7EB" w:sz="4"/>
+              <w:right w:val="single" w:color="E5E7EB" w:sz="4"/>
+            </w:tcBorders>
+            <w:tcMar>
+              <w:top w:type="dxa" w:w="100"/>
+              <w:left w:type="dxa" w:w="140"/>
+              <w:bottom w:type="dxa" w:w="100"/>
+              <w:right w:type="dxa" w:w="140"/>
+            </w:tcMar>
+          </w:tcPr>
+          <w:p>
+            <w:r>
+              <w:rPr>
+                <w:color w:val="1A1F2E"/>
+                <w:sz w:val="21"/>
+                <w:szCs w:val="21"/>
+              </w:rPr>
+              <w:t xml:space="preserve">LTV (Lifetime Value)</w:t>
+            </w:r>
+          </w:p>
+        </w:tc>
+        <w:tc>
+          <w:tcPr>
+            <w:tcW w:type="dxa" w:w="3008"/>
+            <w:tcBorders>
+              <w:top w:val="single" w:color="E5E7EB" w:sz="4"/>
+              <w:left w:val="single" w:color="E5E7EB" w:sz="4"/>
+              <w:bottom w:val="single" w:color="E5E7EB" w:sz="4"/>
+              <w:right w:val="single" w:color="E5E7EB" w:sz="4"/>
+            </w:tcBorders>
+            <w:tcMar>
+              <w:top w:type="dxa" w:w="100"/>
+              <w:left w:type="dxa" w:w="140"/>
+              <w:bottom w:type="dxa" w:w="100"/>
+              <w:right w:type="dxa" w:w="140"/>
+            </w:tcMar>
+          </w:tcPr>
+          <w:p>
+            <w:r>
+              <w:rPr>
+                <w:color w:val="1A1F2E"/>
+                <w:sz w:val="21"/>
+                <w:szCs w:val="21"/>
+              </w:rPr>
+              <w:t xml:space="preserve">[isi: owner]</w:t>
+            </w:r>
+          </w:p>
+        </w:tc>
+        <w:tc>
+          <w:tcPr>
+            <w:tcW w:type="dxa" w:w="3008"/>
+            <w:tcBorders>
+              <w:top w:val="single" w:color="E5E7EB" w:sz="4"/>
+              <w:left w:val="single" w:color="E5E7EB" w:sz="4"/>
+              <w:bottom w:val="single" w:color="E5E7EB" w:sz="4"/>
+              <w:right w:val="single" w:color="E5E7EB" w:sz="4"/>
+            </w:tcBorders>
+            <w:tcMar>
+              <w:top w:type="dxa" w:w="100"/>
+              <w:left w:type="dxa" w:w="140"/>
+              <w:bottom w:type="dxa" w:w="100"/>
+              <w:right w:type="dxa" w:w="140"/>
+            </w:tcMar>
+          </w:tcPr>
+          <w:p>
+            <w:r>
+              <w:rPr>
+                <w:color w:val="1A1F2E"/>
+                <w:sz w:val="21"/>
+                <w:szCs w:val="21"/>
+              </w:rPr>
+              <w:t xml:space="preserve">ARPU × gross margin × umur pelanggan</w:t>
+            </w:r>
+          </w:p>
+        </w:tc>
+      </w:tr>
+      <w:tr>
+        <w:tc>
+          <w:tcPr>
+            <w:tcW w:type="dxa" w:w="3008"/>
+            <w:tcBorders>
+              <w:top w:val="single" w:color="E5E7EB" w:sz="4"/>
+              <w:left w:val="single" w:color="E5E7EB" w:sz="4"/>
+              <w:bottom w:val="single" w:color="E5E7EB" w:sz="4"/>
+              <w:right w:val="single" w:color="E5E7EB" w:sz="4"/>
+            </w:tcBorders>
+            <w:tcMar>
+              <w:top w:type="dxa" w:w="100"/>
+              <w:left w:type="dxa" w:w="140"/>
+              <w:bottom w:type="dxa" w:w="100"/>
+              <w:right w:type="dxa" w:w="140"/>
+            </w:tcMar>
+          </w:tcPr>
+          <w:p>
+            <w:r>
+              <w:rPr>
+                <w:color w:val="1A1F2E"/>
+                <w:sz w:val="21"/>
+                <w:szCs w:val="21"/>
+              </w:rPr>
+              <w:t xml:space="preserve">LTV / CAC</w:t>
+            </w:r>
+          </w:p>
+        </w:tc>
+        <w:tc>
+          <w:tcPr>
+            <w:tcW w:type="dxa" w:w="3008"/>
+            <w:tcBorders>
+              <w:top w:val="single" w:color="E5E7EB" w:sz="4"/>
+              <w:left w:val="single" w:color="E5E7EB" w:sz="4"/>
+              <w:bottom w:val="single" w:color="E5E7EB" w:sz="4"/>
+              <w:right w:val="single" w:color="E5E7EB" w:sz="4"/>
+            </w:tcBorders>
+            <w:tcMar>
+              <w:top w:type="dxa" w:w="100"/>
+              <w:left w:type="dxa" w:w="140"/>
+              <w:bottom w:type="dxa" w:w="100"/>
+              <w:right w:type="dxa" w:w="140"/>
+            </w:tcMar>
+          </w:tcPr>
+          <w:p>
+            <w:r>
+              <w:rPr>
+                <w:color w:val="1A1F2E"/>
+                <w:sz w:val="21"/>
+                <w:szCs w:val="21"/>
+              </w:rPr>
+              <w:t xml:space="preserve">[isi: owner] (target ≥ 3×)</w:t>
+            </w:r>
+          </w:p>
+        </w:tc>
+        <w:tc>
+          <w:tcPr>
+            <w:tcW w:type="dxa" w:w="3008"/>
+            <w:tcBorders>
+              <w:top w:val="single" w:color="E5E7EB" w:sz="4"/>
+              <w:left w:val="single" w:color="E5E7EB" w:sz="4"/>
+              <w:bottom w:val="single" w:color="E5E7EB" w:sz="4"/>
+              <w:right w:val="single" w:color="E5E7EB" w:sz="4"/>
+            </w:tcBorders>
+            <w:tcMar>
+              <w:top w:type="dxa" w:w="100"/>
+              <w:left w:type="dxa" w:w="140"/>
+              <w:bottom w:type="dxa" w:w="100"/>
+              <w:right w:type="dxa" w:w="140"/>
+            </w:tcMar>
+          </w:tcPr>
+          <w:p>
+            <w:r>
+              <w:rPr>
+                <w:color w:val="1A1F2E"/>
+                <w:sz w:val="21"/>
+                <w:szCs w:val="21"/>
+              </w:rPr>
+              <w:t xml:space="preserve">Sehat bila ≥ 3</w:t>
+            </w:r>
+          </w:p>
+        </w:tc>
+      </w:tr>
+      <w:tr>
+        <w:tc>
+          <w:tcPr>
+            <w:tcW w:type="dxa" w:w="3008"/>
+            <w:tcBorders>
+              <w:top w:val="single" w:color="E5E7EB" w:sz="4"/>
+              <w:left w:val="single" w:color="E5E7EB" w:sz="4"/>
+              <w:bottom w:val="single" w:color="E5E7EB" w:sz="4"/>
+              <w:right w:val="single" w:color="E5E7EB" w:sz="4"/>
+            </w:tcBorders>
+            <w:tcMar>
+              <w:top w:type="dxa" w:w="100"/>
+              <w:left w:type="dxa" w:w="140"/>
+              <w:bottom w:type="dxa" w:w="100"/>
+              <w:right w:type="dxa" w:w="140"/>
+            </w:tcMar>
+          </w:tcPr>
+          <w:p>
+            <w:r>
+              <w:rPr>
+                <w:color w:val="1A1F2E"/>
+                <w:sz w:val="21"/>
+                <w:szCs w:val="21"/>
+              </w:rPr>
+              <w:t xml:space="preserve">Payback period</w:t>
+            </w:r>
+          </w:p>
+        </w:tc>
+        <w:tc>
+          <w:tcPr>
+            <w:tcW w:type="dxa" w:w="3008"/>
+            <w:tcBorders>
+              <w:top w:val="single" w:color="E5E7EB" w:sz="4"/>
+              <w:left w:val="single" w:color="E5E7EB" w:sz="4"/>
+              <w:bottom w:val="single" w:color="E5E7EB" w:sz="4"/>
+              <w:right w:val="single" w:color="E5E7EB" w:sz="4"/>
+            </w:tcBorders>
+            <w:tcMar>
+              <w:top w:type="dxa" w:w="100"/>
+              <w:left w:type="dxa" w:w="140"/>
+              <w:bottom w:type="dxa" w:w="100"/>
+              <w:right w:type="dxa" w:w="140"/>
+            </w:tcMar>
+          </w:tcPr>
+          <w:p>
+            <w:r>
+              <w:rPr>
+                <w:color w:val="1A1F2E"/>
+                <w:sz w:val="21"/>
+                <w:szCs w:val="21"/>
+              </w:rPr>
+              <w:t xml:space="preserve">[isi: owner] (target &lt; 12 bln)</w:t>
+            </w:r>
+          </w:p>
+        </w:tc>
+        <w:tc>
+          <w:tcPr>
+            <w:tcW w:type="dxa" w:w="3008"/>
+            <w:tcBorders>
+              <w:top w:val="single" w:color="E5E7EB" w:sz="4"/>
+              <w:left w:val="single" w:color="E5E7EB" w:sz="4"/>
+              <w:bottom w:val="single" w:color="E5E7EB" w:sz="4"/>
+              <w:right w:val="single" w:color="E5E7EB" w:sz="4"/>
+            </w:tcBorders>
+            <w:tcMar>
+              <w:top w:type="dxa" w:w="100"/>
+              <w:left w:type="dxa" w:w="140"/>
+              <w:bottom w:type="dxa" w:w="100"/>
+              <w:right w:type="dxa" w:w="140"/>
+            </w:tcMar>
+          </w:tcPr>
+          <w:p>
+            <w:r>
+              <w:rPr>
+                <w:color w:val="1A1F2E"/>
+                <w:sz w:val="21"/>
+                <w:szCs w:val="21"/>
+              </w:rPr>
+              <w:t xml:space="preserve">Bulan untuk balik modal CAC</w:t>
+            </w:r>
+          </w:p>
+        </w:tc>
+      </w:tr>
+      <w:tr>
+        <w:tc>
+          <w:tcPr>
+            <w:tcW w:type="dxa" w:w="3008"/>
+            <w:tcBorders>
+              <w:top w:val="single" w:color="E5E7EB" w:sz="4"/>
+              <w:left w:val="single" w:color="E5E7EB" w:sz="4"/>
+              <w:bottom w:val="single" w:color="E5E7EB" w:sz="4"/>
+              <w:right w:val="single" w:color="E5E7EB" w:sz="4"/>
+            </w:tcBorders>
+            <w:tcMar>
+              <w:top w:type="dxa" w:w="100"/>
+              <w:left w:type="dxa" w:w="140"/>
+              <w:bottom w:type="dxa" w:w="100"/>
+              <w:right w:type="dxa" w:w="140"/>
+            </w:tcMar>
+          </w:tcPr>
+          <w:p>
+            <w:r>
+              <w:rPr>
+                <w:color w:val="1A1F2E"/>
+                <w:sz w:val="21"/>
+                <w:szCs w:val="21"/>
+              </w:rPr>
+              <w:t xml:space="preserve">Churn bulanan</w:t>
+            </w:r>
+          </w:p>
+        </w:tc>
+        <w:tc>
+          <w:tcPr>
+            <w:tcW w:type="dxa" w:w="3008"/>
+            <w:tcBorders>
+              <w:top w:val="single" w:color="E5E7EB" w:sz="4"/>
+              <w:left w:val="single" w:color="E5E7EB" w:sz="4"/>
+              <w:bottom w:val="single" w:color="E5E7EB" w:sz="4"/>
+              <w:right w:val="single" w:color="E5E7EB" w:sz="4"/>
+            </w:tcBorders>
+            <w:tcMar>
+              <w:top w:type="dxa" w:w="100"/>
+              <w:left w:type="dxa" w:w="140"/>
+              <w:bottom w:type="dxa" w:w="100"/>
+              <w:right w:type="dxa" w:w="140"/>
+            </w:tcMar>
+          </w:tcPr>
+          <w:p>
+            <w:r>
+              <w:rPr>
+                <w:color w:val="1A1F2E"/>
+                <w:sz w:val="21"/>
+                <w:szCs w:val="21"/>
+              </w:rPr>
+              <w:t xml:space="preserve">[isi: owner] (target &lt; 3%)</w:t>
+            </w:r>
+          </w:p>
+        </w:tc>
+        <w:tc>
+          <w:tcPr>
+            <w:tcW w:type="dxa" w:w="3008"/>
+            <w:tcBorders>
+              <w:top w:val="single" w:color="E5E7EB" w:sz="4"/>
+              <w:left w:val="single" w:color="E5E7EB" w:sz="4"/>
+              <w:bottom w:val="single" w:color="E5E7EB" w:sz="4"/>
+              <w:right w:val="single" w:color="E5E7EB" w:sz="4"/>
+            </w:tcBorders>
+            <w:tcMar>
+              <w:top w:type="dxa" w:w="100"/>
+              <w:left w:type="dxa" w:w="140"/>
+              <w:bottom w:type="dxa" w:w="100"/>
+              <w:right w:type="dxa" w:w="140"/>
+            </w:tcMar>
+          </w:tcPr>
+          <w:p>
+            <w:r>
+              <w:rPr>
+                <w:color w:val="1A1F2E"/>
+                <w:sz w:val="21"/>
+                <w:szCs w:val="21"/>
+              </w:rPr>
+              <w:t xml:space="preserve">% tenant berhenti/bulan</w:t>
+            </w:r>
+          </w:p>
+        </w:tc>
+      </w:tr>
+      <w:tr>
+        <w:tc>
+          <w:tcPr>
+            <w:tcW w:type="dxa" w:w="3008"/>
+            <w:tcBorders>
+              <w:top w:val="single" w:color="E5E7EB" w:sz="4"/>
+              <w:left w:val="single" w:color="E5E7EB" w:sz="4"/>
+              <w:bottom w:val="single" w:color="E5E7EB" w:sz="4"/>
+              <w:right w:val="single" w:color="E5E7EB" w:sz="4"/>
+            </w:tcBorders>
+            <w:tcMar>
+              <w:top w:type="dxa" w:w="100"/>
+              <w:left w:type="dxa" w:w="140"/>
+              <w:bottom w:type="dxa" w:w="100"/>
+              <w:right w:type="dxa" w:w="140"/>
+            </w:tcMar>
+          </w:tcPr>
+          <w:p>
+            <w:r>
+              <w:rPr>
+                <w:color w:val="1A1F2E"/>
+                <w:sz w:val="21"/>
+                <w:szCs w:val="21"/>
+              </w:rPr>
+              <w:t xml:space="preserve">Net Revenue Retention</w:t>
+            </w:r>
+          </w:p>
+        </w:tc>
+        <w:tc>
+          <w:tcPr>
+            <w:tcW w:type="dxa" w:w="3008"/>
+            <w:tcBorders>
+              <w:top w:val="single" w:color="E5E7EB" w:sz="4"/>
+              <w:left w:val="single" w:color="E5E7EB" w:sz="4"/>
+              <w:bottom w:val="single" w:color="E5E7EB" w:sz="4"/>
+              <w:right w:val="single" w:color="E5E7EB" w:sz="4"/>
+            </w:tcBorders>
+            <w:tcMar>
+              <w:top w:type="dxa" w:w="100"/>
+              <w:left w:type="dxa" w:w="140"/>
+              <w:bottom w:type="dxa" w:w="100"/>
+              <w:right w:type="dxa" w:w="140"/>
+            </w:tcMar>
+          </w:tcPr>
+          <w:p>
+            <w:r>
+              <w:rPr>
+                <w:color w:val="1A1F2E"/>
+                <w:sz w:val="21"/>
+                <w:szCs w:val="21"/>
+              </w:rPr>
+              <w:t xml:space="preserve">[isi: owner] (target &gt; 100%)</w:t>
+            </w:r>
+          </w:p>
+        </w:tc>
+        <w:tc>
+          <w:tcPr>
+            <w:tcW w:type="dxa" w:w="3008"/>
+            <w:tcBorders>
+              <w:top w:val="single" w:color="E5E7EB" w:sz="4"/>
+              <w:left w:val="single" w:color="E5E7EB" w:sz="4"/>
+              <w:bottom w:val="single" w:color="E5E7EB" w:sz="4"/>
+              <w:right w:val="single" w:color="E5E7EB" w:sz="4"/>
+            </w:tcBorders>
+            <w:tcMar>
+              <w:top w:type="dxa" w:w="100"/>
+              <w:left w:type="dxa" w:w="140"/>
+              <w:bottom w:type="dxa" w:w="100"/>
+              <w:right w:type="dxa" w:w="140"/>
+            </w:tcMar>
+          </w:tcPr>
+          <w:p>
+            <w:r>
+              <w:rPr>
+                <w:color w:val="1A1F2E"/>
+                <w:sz w:val="21"/>
+                <w:szCs w:val="21"/>
+              </w:rPr>
+              <w:t xml:space="preserve">Ekspansi (upgrade tier + coin) − churn</w:t>
+            </w:r>
+          </w:p>
+        </w:tc>
+      </w:tr>
+    </w:tbl>
+    <w:p>
+      <w:pPr>
+        <w:pBdr>
+          <w:left w:val="single" w:color="F59E0B" w:sz="24" w:space="12"/>
+        </w:pBdr>
+        <w:shd w:fill="FEF3C7" w:val="clear"/>
+        <w:spacing w:after="160" w:before="160"/>
+      </w:pPr>
+      <w:r>
+        <w:rPr>
+          <w:b/>
+          <w:bCs/>
+          <w:color w:val="1A1F2E"/>
+          <w:sz w:val="22"/>
+          <w:szCs w:val="22"/>
+        </w:rPr>
+        <w:t xml:space="preserve">Asumsi pertumbuhan (perlu divalidasi): </w:t>
+      </w:r>
+      <w:r>
+        <w:rPr>
+          <w:i/>
+          <w:iCs/>
+          <w:color w:val="1A1F2E"/>
+          <w:sz w:val="22"/>
+          <w:szCs w:val="22"/>
+        </w:rPr>
+        <w:t xml:space="preserve">target 50→1.000 tenant dalam 18 bln mengasumsikan kapasitas sales, conversion rate trial→bayar, dan churn tertentu. Model driver + sensitivitas (skenario konservatif/basis/optimis): </w:t>
+      </w:r>
+      <w:r>
+        <w:rPr>
+          <w:i/>
+          <w:iCs/>
+          <w:color w:val="F59E0B"/>
+          <w:sz w:val="22"/>
+          <w:szCs w:val="22"/>
+        </w:rPr>
+        <w:t xml:space="preserve">[isi: owner]</w:t>
+      </w:r>
+    </w:p>
+    <w:p>
+      <w:pPr>
+        <w:pBdr>
+          <w:left w:val="single" w:color="84CC16" w:sz="24" w:space="12"/>
+        </w:pBdr>
+        <w:shd w:fill="ECFCCB" w:val="clear"/>
+        <w:spacing w:after="160" w:before="160"/>
+      </w:pPr>
+      <w:r>
+        <w:rPr>
+          <w:b/>
+          <w:bCs/>
+          <w:color w:val="1A1F2E"/>
+          <w:sz w:val="22"/>
+          <w:szCs w:val="22"/>
+        </w:rPr>
+        <w:t xml:space="preserve">Strategi: </w:t>
+      </w:r>
+      <w:r>
+        <w:rPr>
+          <w:i/>
+          <w:iCs/>
+          <w:color w:val="1A1F2E"/>
+          <w:sz w:val="22"/>
+          <w:szCs w:val="22"/>
+        </w:rPr>
+        <w:t xml:space="preserve">AI sebagai growth engine — bukan cost center. Coin top-up margin 70-80% setelah Anthropic API cost. Higher engagement = higher coin spend = higher revenue.</w:t>
+      </w:r>
+    </w:p>
+    <w:p>
+      <w:r>
+        <w:br w:type="page"/>
+      </w:r>
+    </w:p>
+    <w:p>
+      <w:pPr>
+        <w:pStyle w:val="Heading1"/>
+        <w:spacing w:after="200" w:before="480"/>
+      </w:pPr>
+      <w:r>
+        <w:t xml:space="preserve">Traction &amp; Current State</w:t>
+      </w:r>
+    </w:p>
+    <w:p>
+      <w:pPr>
+        <w:pStyle w:val="Heading2"/>
+        <w:spacing w:after="120" w:before="320"/>
+      </w:pPr>
+      <w:r>
+        <w:t xml:space="preserve">Product Maturity</w:t>
+      </w:r>
+    </w:p>
+    <w:p>
+      <w:pPr>
+        <w:pBdr>
+          <w:left w:val="single" w:color="0BC3B0" w:sz="24" w:space="12"/>
+        </w:pBdr>
+        <w:shd w:fill="E6FCF9" w:val="clear"/>
+        <w:spacing w:after="160" w:before="160"/>
+      </w:pPr>
+      <w:r>
+        <w:rPr>
+          <w:b/>
+          <w:bCs/>
+          <w:color w:val="0BC3B0"/>
+          <w:sz w:val="24"/>
+          <w:szCs w:val="24"/>
+        </w:rPr>
+        <w:t xml:space="preserve">✓ Platform LIVE di production </w:t>
+      </w:r>
+      <w:r>
+        <w:rPr>
+          <w:color w:val="1A1F2E"/>
+          <w:sz w:val="22"/>
+          <w:szCs w:val="22"/>
+        </w:rPr>
+        <w:t xml:space="preserve">(lamasy.harpy.id) dengan tenant transaksi aktif.</w:t>
+      </w:r>
+    </w:p>
+    <w:p>
+      <w:pPr>
+        <w:pStyle w:val="Heading2"/>
+        <w:spacing w:after="120" w:before="320"/>
+      </w:pPr>
+      <w:r>
+        <w:t xml:space="preserve">Technical Stats</w:t>
+      </w:r>
+    </w:p>
+    <w:tbl>
+      <w:tblPr>
+        <w:tblW w:type="dxa" w:w="9026"/>
+        <w:tblBorders>
+          <w:top w:val="single" w:color="auto" w:sz="4"/>
+          <w:left w:val="single" w:color="auto" w:sz="4"/>
+          <w:bottom w:val="single" w:color="auto" w:sz="4"/>
+          <w:right w:val="single" w:color="auto" w:sz="4"/>
+          <w:insideH w:val="single" w:color="auto" w:sz="4"/>
+          <w:insideV w:val="single" w:color="auto" w:sz="4"/>
+        </w:tblBorders>
+      </w:tblPr>
+      <w:tblGrid>
+        <w:gridCol w:w="3008"/>
+        <w:gridCol w:w="3008"/>
+        <w:gridCol w:w="3008"/>
+      </w:tblGrid>
+      <w:tr>
+        <w:trPr>
+          <w:tblHeader/>
+        </w:trPr>
+        <w:tc>
+          <w:tcPr>
+            <w:tcW w:type="dxa" w:w="3008"/>
+            <w:tcBorders>
+              <w:top w:val="single" w:color="E5E7EB" w:sz="4"/>
+              <w:left w:val="single" w:color="E5E7EB" w:sz="4"/>
+              <w:bottom w:val="single" w:color="E5E7EB" w:sz="4"/>
+              <w:right w:val="single" w:color="E5E7EB" w:sz="4"/>
+            </w:tcBorders>
+            <w:shd w:fill="0F1C3A" w:val="clear"/>
+            <w:tcMar>
+              <w:top w:type="dxa" w:w="100"/>
+              <w:left w:type="dxa" w:w="140"/>
+              <w:bottom w:type="dxa" w:w="100"/>
+              <w:right w:type="dxa" w:w="140"/>
+            </w:tcMar>
+          </w:tcPr>
+          <w:p>
+            <w:r>
+              <w:rPr>
+                <w:b/>
+                <w:bCs/>
+                <w:color w:val="FFFFFF"/>
+                <w:sz w:val="20"/>
+                <w:szCs w:val="20"/>
+              </w:rPr>
               <w:t xml:space="preserve">Component</w:t>
             </w:r>
           </w:p>
@@ -6496,7 +7210,7 @@
           <w:b/>
           <w:bCs/>
         </w:rPr>
-        <w:t xml:space="preserve">✓ Laporan keuangan SAK EMKM compliant auto-generate</w:t>
+        <w:t xml:space="preserve">✓ Laporan keuangan mengacu SAK EMKM (auto-generate)</w:t>
       </w:r>
     </w:p>
     <w:p>
@@ -6581,7 +7295,7 @@
           <w:b/>
           <w:bCs/>
         </w:rPr>
-        <w:t xml:space="preserve">✓ UU PDP + SAK EMKM + UU ITE compliance</w:t>
+        <w:t xml:space="preserve">✓ Dirancang selaras UU PDP + SAK EMKM + UU ITE</w:t>
       </w:r>
     </w:p>
     <w:p>
@@ -8632,6 +9346,541 @@
         <w:spacing w:after="200" w:before="480"/>
       </w:pPr>
       <w:r>
+        <w:t xml:space="preserve">Risiko &amp; Mitigasi</w:t>
+      </w:r>
+    </w:p>
+    <w:p>
+      <w:pPr>
+        <w:spacing w:after="120" w:line="360"/>
+      </w:pPr>
+      <w:r>
+        <w:t xml:space="preserve">Pengungkapan jujur untuk diligence — risiko utama dan rencana mitigasinya:</w:t>
+      </w:r>
+    </w:p>
+    <w:tbl>
+      <w:tblPr>
+        <w:tblW w:type="dxa" w:w="9026"/>
+        <w:tblBorders>
+          <w:top w:val="single" w:color="auto" w:sz="4"/>
+          <w:left w:val="single" w:color="auto" w:sz="4"/>
+          <w:bottom w:val="single" w:color="auto" w:sz="4"/>
+          <w:right w:val="single" w:color="auto" w:sz="4"/>
+          <w:insideH w:val="single" w:color="auto" w:sz="4"/>
+          <w:insideV w:val="single" w:color="auto" w:sz="4"/>
+        </w:tblBorders>
+      </w:tblPr>
+      <w:tblGrid>
+        <w:gridCol w:w="4513"/>
+        <w:gridCol w:w="4513"/>
+      </w:tblGrid>
+      <w:tr>
+        <w:trPr>
+          <w:tblHeader/>
+        </w:trPr>
+        <w:tc>
+          <w:tcPr>
+            <w:tcW w:type="dxa" w:w="4513"/>
+            <w:tcBorders>
+              <w:top w:val="single" w:color="E5E7EB" w:sz="4"/>
+              <w:left w:val="single" w:color="E5E7EB" w:sz="4"/>
+              <w:bottom w:val="single" w:color="E5E7EB" w:sz="4"/>
+              <w:right w:val="single" w:color="E5E7EB" w:sz="4"/>
+            </w:tcBorders>
+            <w:shd w:fill="0F1C3A" w:val="clear"/>
+            <w:tcMar>
+              <w:top w:type="dxa" w:w="100"/>
+              <w:left w:type="dxa" w:w="140"/>
+              <w:bottom w:type="dxa" w:w="100"/>
+              <w:right w:type="dxa" w:w="140"/>
+            </w:tcMar>
+          </w:tcPr>
+          <w:p>
+            <w:r>
+              <w:rPr>
+                <w:b/>
+                <w:bCs/>
+                <w:color w:val="FFFFFF"/>
+                <w:sz w:val="20"/>
+                <w:szCs w:val="20"/>
+              </w:rPr>
+              <w:t xml:space="preserve">Risiko</w:t>
+            </w:r>
+          </w:p>
+        </w:tc>
+        <w:tc>
+          <w:tcPr>
+            <w:tcW w:type="dxa" w:w="4513"/>
+            <w:tcBorders>
+              <w:top w:val="single" w:color="E5E7EB" w:sz="4"/>
+              <w:left w:val="single" w:color="E5E7EB" w:sz="4"/>
+              <w:bottom w:val="single" w:color="E5E7EB" w:sz="4"/>
+              <w:right w:val="single" w:color="E5E7EB" w:sz="4"/>
+            </w:tcBorders>
+            <w:shd w:fill="0F1C3A" w:val="clear"/>
+            <w:tcMar>
+              <w:top w:type="dxa" w:w="100"/>
+              <w:left w:type="dxa" w:w="140"/>
+              <w:bottom w:type="dxa" w:w="100"/>
+              <w:right w:type="dxa" w:w="140"/>
+            </w:tcMar>
+          </w:tcPr>
+          <w:p>
+            <w:r>
+              <w:rPr>
+                <w:b/>
+                <w:bCs/>
+                <w:color w:val="FFFFFF"/>
+                <w:sz w:val="20"/>
+                <w:szCs w:val="20"/>
+              </w:rPr>
+              <w:t xml:space="preserve">Mitigasi</w:t>
+            </w:r>
+          </w:p>
+        </w:tc>
+      </w:tr>
+      <w:tr>
+        <w:tc>
+          <w:tcPr>
+            <w:tcW w:type="dxa" w:w="4513"/>
+            <w:tcBorders>
+              <w:top w:val="single" w:color="E5E7EB" w:sz="4"/>
+              <w:left w:val="single" w:color="E5E7EB" w:sz="4"/>
+              <w:bottom w:val="single" w:color="E5E7EB" w:sz="4"/>
+              <w:right w:val="single" w:color="E5E7EB" w:sz="4"/>
+            </w:tcBorders>
+            <w:tcMar>
+              <w:top w:type="dxa" w:w="100"/>
+              <w:left w:type="dxa" w:w="140"/>
+              <w:bottom w:type="dxa" w:w="100"/>
+              <w:right w:type="dxa" w:w="140"/>
+            </w:tcMar>
+          </w:tcPr>
+          <w:p>
+            <w:r>
+              <w:rPr>
+                <w:color w:val="1A1F2E"/>
+                <w:sz w:val="21"/>
+                <w:szCs w:val="21"/>
+              </w:rPr>
+              <w:t xml:space="preserve">Solo founder (bus factor, kapasitas)</w:t>
+            </w:r>
+          </w:p>
+        </w:tc>
+        <w:tc>
+          <w:tcPr>
+            <w:tcW w:type="dxa" w:w="4513"/>
+            <w:tcBorders>
+              <w:top w:val="single" w:color="E5E7EB" w:sz="4"/>
+              <w:left w:val="single" w:color="E5E7EB" w:sz="4"/>
+              <w:bottom w:val="single" w:color="E5E7EB" w:sz="4"/>
+              <w:right w:val="single" w:color="E5E7EB" w:sz="4"/>
+            </w:tcBorders>
+            <w:tcMar>
+              <w:top w:type="dxa" w:w="100"/>
+              <w:left w:type="dxa" w:w="140"/>
+              <w:bottom w:type="dxa" w:w="100"/>
+              <w:right w:type="dxa" w:w="140"/>
+            </w:tcMar>
+          </w:tcPr>
+          <w:p>
+            <w:r>
+              <w:rPr>
+                <w:color w:val="1A1F2E"/>
+                <w:sz w:val="21"/>
+                <w:szCs w:val="21"/>
+              </w:rPr>
+              <w:t xml:space="preserve">Prioritas hire Engineer #2 + Sales Lead pasca-pendanaan; dokumentasi &amp; workflow AI-assisted; advisor</w:t>
+            </w:r>
+          </w:p>
+        </w:tc>
+      </w:tr>
+      <w:tr>
+        <w:tc>
+          <w:tcPr>
+            <w:tcW w:type="dxa" w:w="4513"/>
+            <w:tcBorders>
+              <w:top w:val="single" w:color="E5E7EB" w:sz="4"/>
+              <w:left w:val="single" w:color="E5E7EB" w:sz="4"/>
+              <w:bottom w:val="single" w:color="E5E7EB" w:sz="4"/>
+              <w:right w:val="single" w:color="E5E7EB" w:sz="4"/>
+            </w:tcBorders>
+            <w:tcMar>
+              <w:top w:type="dxa" w:w="100"/>
+              <w:left w:type="dxa" w:w="140"/>
+              <w:bottom w:type="dxa" w:w="100"/>
+              <w:right w:type="dxa" w:w="140"/>
+            </w:tcMar>
+          </w:tcPr>
+          <w:p>
+            <w:r>
+              <w:rPr>
+                <w:color w:val="1A1F2E"/>
+                <w:sz w:val="21"/>
+                <w:szCs w:val="21"/>
+              </w:rPr>
+              <w:t xml:space="preserve">Infra single shared-hosting</w:t>
+            </w:r>
+          </w:p>
+        </w:tc>
+        <w:tc>
+          <w:tcPr>
+            <w:tcW w:type="dxa" w:w="4513"/>
+            <w:tcBorders>
+              <w:top w:val="single" w:color="E5E7EB" w:sz="4"/>
+              <w:left w:val="single" w:color="E5E7EB" w:sz="4"/>
+              <w:bottom w:val="single" w:color="E5E7EB" w:sz="4"/>
+              <w:right w:val="single" w:color="E5E7EB" w:sz="4"/>
+            </w:tcBorders>
+            <w:tcMar>
+              <w:top w:type="dxa" w:w="100"/>
+              <w:left w:type="dxa" w:w="140"/>
+              <w:bottom w:type="dxa" w:w="100"/>
+              <w:right w:type="dxa" w:w="140"/>
+            </w:tcMar>
+          </w:tcPr>
+          <w:p>
+            <w:r>
+              <w:rPr>
+                <w:color w:val="1A1F2E"/>
+                <w:sz w:val="21"/>
+                <w:szCs w:val="21"/>
+              </w:rPr>
+              <w:t xml:space="preserve">Roadmap migrasi ke cloud terkelola (AWS/GCP) saat skala; backup harian; rencana DR &amp; monitoring</w:t>
+            </w:r>
+          </w:p>
+        </w:tc>
+      </w:tr>
+      <w:tr>
+        <w:tc>
+          <w:tcPr>
+            <w:tcW w:type="dxa" w:w="4513"/>
+            <w:tcBorders>
+              <w:top w:val="single" w:color="E5E7EB" w:sz="4"/>
+              <w:left w:val="single" w:color="E5E7EB" w:sz="4"/>
+              <w:bottom w:val="single" w:color="E5E7EB" w:sz="4"/>
+              <w:right w:val="single" w:color="E5E7EB" w:sz="4"/>
+            </w:tcBorders>
+            <w:tcMar>
+              <w:top w:type="dxa" w:w="100"/>
+              <w:left w:type="dxa" w:w="140"/>
+              <w:bottom w:type="dxa" w:w="100"/>
+              <w:right w:type="dxa" w:w="140"/>
+            </w:tcMar>
+          </w:tcPr>
+          <w:p>
+            <w:r>
+              <w:rPr>
+                <w:color w:val="1A1F2E"/>
+                <w:sz w:val="21"/>
+                <w:szCs w:val="21"/>
+              </w:rPr>
+              <w:t xml:space="preserve">Isolasi data multi-tenant (1 query lupa scope = bocor)</w:t>
+            </w:r>
+          </w:p>
+        </w:tc>
+        <w:tc>
+          <w:tcPr>
+            <w:tcW w:type="dxa" w:w="4513"/>
+            <w:tcBorders>
+              <w:top w:val="single" w:color="E5E7EB" w:sz="4"/>
+              <w:left w:val="single" w:color="E5E7EB" w:sz="4"/>
+              <w:bottom w:val="single" w:color="E5E7EB" w:sz="4"/>
+              <w:right w:val="single" w:color="E5E7EB" w:sz="4"/>
+            </w:tcBorders>
+            <w:tcMar>
+              <w:top w:type="dxa" w:w="100"/>
+              <w:left w:type="dxa" w:w="140"/>
+              <w:bottom w:type="dxa" w:w="100"/>
+              <w:right w:type="dxa" w:w="140"/>
+            </w:tcMar>
+          </w:tcPr>
+          <w:p>
+            <w:r>
+              <w:rPr>
+                <w:color w:val="1A1F2E"/>
+                <w:sz w:val="21"/>
+                <w:szCs w:val="21"/>
+              </w:rPr>
+              <w:t xml:space="preserve">Scoping terpusat di TenantQuery + audit berkala; rencana test isolasi otomatis</w:t>
+            </w:r>
+          </w:p>
+        </w:tc>
+      </w:tr>
+      <w:tr>
+        <w:tc>
+          <w:tcPr>
+            <w:tcW w:type="dxa" w:w="4513"/>
+            <w:tcBorders>
+              <w:top w:val="single" w:color="E5E7EB" w:sz="4"/>
+              <w:left w:val="single" w:color="E5E7EB" w:sz="4"/>
+              <w:bottom w:val="single" w:color="E5E7EB" w:sz="4"/>
+              <w:right w:val="single" w:color="E5E7EB" w:sz="4"/>
+            </w:tcBorders>
+            <w:tcMar>
+              <w:top w:type="dxa" w:w="100"/>
+              <w:left w:type="dxa" w:w="140"/>
+              <w:bottom w:type="dxa" w:w="100"/>
+              <w:right w:type="dxa" w:w="140"/>
+            </w:tcMar>
+          </w:tcPr>
+          <w:p>
+            <w:r>
+              <w:rPr>
+                <w:color w:val="1A1F2E"/>
+                <w:sz w:val="21"/>
+                <w:szCs w:val="21"/>
+              </w:rPr>
+              <w:t xml:space="preserve">Ketergantungan 1 vendor AI (Anthropic)</w:t>
+            </w:r>
+          </w:p>
+        </w:tc>
+        <w:tc>
+          <w:tcPr>
+            <w:tcW w:type="dxa" w:w="4513"/>
+            <w:tcBorders>
+              <w:top w:val="single" w:color="E5E7EB" w:sz="4"/>
+              <w:left w:val="single" w:color="E5E7EB" w:sz="4"/>
+              <w:bottom w:val="single" w:color="E5E7EB" w:sz="4"/>
+              <w:right w:val="single" w:color="E5E7EB" w:sz="4"/>
+            </w:tcBorders>
+            <w:tcMar>
+              <w:top w:type="dxa" w:w="100"/>
+              <w:left w:type="dxa" w:w="140"/>
+              <w:bottom w:type="dxa" w:w="100"/>
+              <w:right w:type="dxa" w:w="140"/>
+            </w:tcMar>
+          </w:tcPr>
+          <w:p>
+            <w:r>
+              <w:rPr>
+                <w:color w:val="1A1F2E"/>
+                <w:sz w:val="21"/>
+                <w:szCs w:val="21"/>
+              </w:rPr>
+              <w:t xml:space="preserve">Biaya di-meter &amp; di-cap (coin/budget); arsitektur AI di belakang adapter → bisa ganti/ tambah model</w:t>
+            </w:r>
+          </w:p>
+        </w:tc>
+      </w:tr>
+      <w:tr>
+        <w:tc>
+          <w:tcPr>
+            <w:tcW w:type="dxa" w:w="4513"/>
+            <w:tcBorders>
+              <w:top w:val="single" w:color="E5E7EB" w:sz="4"/>
+              <w:left w:val="single" w:color="E5E7EB" w:sz="4"/>
+              <w:bottom w:val="single" w:color="E5E7EB" w:sz="4"/>
+              <w:right w:val="single" w:color="E5E7EB" w:sz="4"/>
+            </w:tcBorders>
+            <w:tcMar>
+              <w:top w:type="dxa" w:w="100"/>
+              <w:left w:type="dxa" w:w="140"/>
+              <w:bottom w:type="dxa" w:w="100"/>
+              <w:right w:type="dxa" w:w="140"/>
+            </w:tcMar>
+          </w:tcPr>
+          <w:p>
+            <w:r>
+              <w:rPr>
+                <w:color w:val="1A1F2E"/>
+                <w:sz w:val="21"/>
+                <w:szCs w:val="21"/>
+              </w:rPr>
+              <w:t xml:space="preserve">Respon kompetitor (Smartlink/Cuci.Co bangun AI)</w:t>
+            </w:r>
+          </w:p>
+        </w:tc>
+        <w:tc>
+          <w:tcPr>
+            <w:tcW w:type="dxa" w:w="4513"/>
+            <w:tcBorders>
+              <w:top w:val="single" w:color="E5E7EB" w:sz="4"/>
+              <w:left w:val="single" w:color="E5E7EB" w:sz="4"/>
+              <w:bottom w:val="single" w:color="E5E7EB" w:sz="4"/>
+              <w:right w:val="single" w:color="E5E7EB" w:sz="4"/>
+            </w:tcBorders>
+            <w:tcMar>
+              <w:top w:type="dxa" w:w="100"/>
+              <w:left w:type="dxa" w:w="140"/>
+              <w:bottom w:type="dxa" w:w="100"/>
+              <w:right w:type="dxa" w:w="140"/>
+            </w:tcMar>
+          </w:tcPr>
+          <w:p>
+            <w:r>
+              <w:rPr>
+                <w:color w:val="1A1F2E"/>
+                <w:sz w:val="21"/>
+                <w:szCs w:val="21"/>
+              </w:rPr>
+              <w:t xml:space="preserve">Lead waktu + data flywheel + kedalaman vertikal; eksekusi cepat (auto-deploy)</w:t>
+            </w:r>
+          </w:p>
+        </w:tc>
+      </w:tr>
+      <w:tr>
+        <w:tc>
+          <w:tcPr>
+            <w:tcW w:type="dxa" w:w="4513"/>
+            <w:tcBorders>
+              <w:top w:val="single" w:color="E5E7EB" w:sz="4"/>
+              <w:left w:val="single" w:color="E5E7EB" w:sz="4"/>
+              <w:bottom w:val="single" w:color="E5E7EB" w:sz="4"/>
+              <w:right w:val="single" w:color="E5E7EB" w:sz="4"/>
+            </w:tcBorders>
+            <w:tcMar>
+              <w:top w:type="dxa" w:w="100"/>
+              <w:left w:type="dxa" w:w="140"/>
+              <w:bottom w:type="dxa" w:w="100"/>
+              <w:right w:type="dxa" w:w="140"/>
+            </w:tcMar>
+          </w:tcPr>
+          <w:p>
+            <w:r>
+              <w:rPr>
+                <w:color w:val="1A1F2E"/>
+                <w:sz w:val="21"/>
+                <w:szCs w:val="21"/>
+              </w:rPr>
+              <w:t xml:space="preserve">Regulasi (UU PDP/ITE) &amp; pajak</w:t>
+            </w:r>
+          </w:p>
+        </w:tc>
+        <w:tc>
+          <w:tcPr>
+            <w:tcW w:type="dxa" w:w="4513"/>
+            <w:tcBorders>
+              <w:top w:val="single" w:color="E5E7EB" w:sz="4"/>
+              <w:left w:val="single" w:color="E5E7EB" w:sz="4"/>
+              <w:bottom w:val="single" w:color="E5E7EB" w:sz="4"/>
+              <w:right w:val="single" w:color="E5E7EB" w:sz="4"/>
+            </w:tcBorders>
+            <w:tcMar>
+              <w:top w:type="dxa" w:w="100"/>
+              <w:left w:type="dxa" w:w="140"/>
+              <w:bottom w:type="dxa" w:w="100"/>
+              <w:right w:type="dxa" w:w="140"/>
+            </w:tcMar>
+          </w:tcPr>
+          <w:p>
+            <w:r>
+              <w:rPr>
+                <w:color w:val="1A1F2E"/>
+                <w:sz w:val="21"/>
+                <w:szCs w:val="21"/>
+              </w:rPr>
+              <w:t xml:space="preserve">Desain selaras regulasi + mekanisme hapus data; konsultasi legal sebelum klaim sertifikasi</w:t>
+            </w:r>
+          </w:p>
+        </w:tc>
+      </w:tr>
+      <w:tr>
+        <w:tc>
+          <w:tcPr>
+            <w:tcW w:type="dxa" w:w="4513"/>
+            <w:tcBorders>
+              <w:top w:val="single" w:color="E5E7EB" w:sz="4"/>
+              <w:left w:val="single" w:color="E5E7EB" w:sz="4"/>
+              <w:bottom w:val="single" w:color="E5E7EB" w:sz="4"/>
+              <w:right w:val="single" w:color="E5E7EB" w:sz="4"/>
+            </w:tcBorders>
+            <w:tcMar>
+              <w:top w:type="dxa" w:w="100"/>
+              <w:left w:type="dxa" w:w="140"/>
+              <w:bottom w:type="dxa" w:w="100"/>
+              <w:right w:type="dxa" w:w="140"/>
+            </w:tcMar>
+          </w:tcPr>
+          <w:p>
+            <w:r>
+              <w:rPr>
+                <w:color w:val="1A1F2E"/>
+                <w:sz w:val="21"/>
+                <w:szCs w:val="21"/>
+              </w:rPr>
+              <w:t xml:space="preserve">Volatilitas biaya AI / margin</w:t>
+            </w:r>
+          </w:p>
+        </w:tc>
+        <w:tc>
+          <w:tcPr>
+            <w:tcW w:type="dxa" w:w="4513"/>
+            <w:tcBorders>
+              <w:top w:val="single" w:color="E5E7EB" w:sz="4"/>
+              <w:left w:val="single" w:color="E5E7EB" w:sz="4"/>
+              <w:bottom w:val="single" w:color="E5E7EB" w:sz="4"/>
+              <w:right w:val="single" w:color="E5E7EB" w:sz="4"/>
+            </w:tcBorders>
+            <w:tcMar>
+              <w:top w:type="dxa" w:w="100"/>
+              <w:left w:type="dxa" w:w="140"/>
+              <w:bottom w:type="dxa" w:w="100"/>
+              <w:right w:type="dxa" w:w="140"/>
+            </w:tcMar>
+          </w:tcPr>
+          <w:p>
+            <w:r>
+              <w:rPr>
+                <w:color w:val="1A1F2E"/>
+                <w:sz w:val="21"/>
+                <w:szCs w:val="21"/>
+              </w:rPr>
+              <w:t xml:space="preserve">Cache + rate-limit + pricing coin pay-as-you-use yang bisa disesuaikan</w:t>
+            </w:r>
+          </w:p>
+        </w:tc>
+      </w:tr>
+    </w:tbl>
+    <w:p>
+      <w:pPr>
+        <w:pBdr>
+          <w:left w:val="single" w:color="A78BFA" w:sz="24" w:space="12"/>
+        </w:pBdr>
+        <w:shd w:fill="F4F0FE" w:val="clear"/>
+        <w:spacing w:after="160" w:before="160"/>
+      </w:pPr>
+      <w:r>
+        <w:rPr>
+          <w:b/>
+          <w:bCs/>
+          <w:color w:val="1A1F2E"/>
+          <w:sz w:val="22"/>
+          <w:szCs w:val="22"/>
+        </w:rPr>
+        <w:t xml:space="preserve">Governance: </w:t>
+      </w:r>
+      <w:r>
+        <w:rPr>
+          <w:i/>
+          <w:iCs/>
+          <w:color w:val="1A1F2E"/>
+          <w:sz w:val="22"/>
+          <w:szCs w:val="22"/>
+        </w:rPr>
+        <w:t xml:space="preserve">pasca-pendanaan, KPI inti (MRR, tenant aktif, churn, CAC, runway) dilaporkan ke board secara berkala; penggunaan dana ditrack per kategori. Cadence &amp; detail: </w:t>
+      </w:r>
+      <w:r>
+        <w:rPr>
+          <w:i/>
+          <w:iCs/>
+          <w:color w:val="F59E0B"/>
+          <w:sz w:val="22"/>
+          <w:szCs w:val="22"/>
+        </w:rPr>
+        <w:t xml:space="preserve">[isi: owner]</w:t>
+      </w:r>
+    </w:p>
+    <w:p>
+      <w:r>
+        <w:br w:type="page"/>
+      </w:r>
+    </w:p>
+    <w:p>
+      <w:pPr>
+        <w:pStyle w:val="Heading1"/>
+        <w:spacing w:after="200" w:before="480"/>
+      </w:pPr>
+      <w:r>
         <w:t xml:space="preserve">The Ask</w:t>
       </w:r>
     </w:p>
@@ -9525,10 +10774,10 @@
           <w:b/>
           <w:bCs/>
         </w:rPr>
-        <w:t xml:space="preserve">SAK EMKM compliant </w:t>
-      </w:r>
-      <w:r>
-        <w:t xml:space="preserve">laporan keuangan otomatis untuk pajak.</w:t>
+        <w:t xml:space="preserve">Laporan keuangan mengacu SAK EMKM </w:t>
+      </w:r>
+      <w:r>
+        <w:t xml:space="preserve">— otomatis untuk pajak.</w:t>
       </w:r>
     </w:p>
     <w:p>
@@ -9588,7 +10837,7 @@
         <w:t xml:space="preserve">Comprehensive audit </w:t>
       </w:r>
       <w:r>
-        <w:t xml:space="preserve">semua action sensitif logged → compliance-ready.</w:t>
+        <w:t xml:space="preserve">semua action sensitif logged → mendukung kepatuhan.</w:t>
       </w:r>
     </w:p>
     <w:p>

</xml_diff>